<commit_message>
Fixing Test Cases for Login - Anderson 4/13/26
</commit_message>
<xml_diff>
--- a/MODULE-5/Bravo_test_cases.docx
+++ b/MODULE-5/Bravo_test_cases.docx
@@ -200,7 +200,6 @@
                 <w:szCs w:val="20"/>
               </w:rPr>
             </w:pPr>
-            <w:proofErr w:type="spellStart"/>
             <w:r>
               <w:rPr>
                 <w:rFonts w:ascii="Arial" w:hAnsi="Arial" w:cs="Arial"/>
@@ -218,17 +217,7 @@
                 <w:sz w:val="20"/>
                 <w:szCs w:val="20"/>
               </w:rPr>
-              <w:t>Testing</w:t>
-            </w:r>
-            <w:proofErr w:type="spellEnd"/>
-            <w:r>
-              <w:rPr>
-                <w:rFonts w:ascii="Arial" w:hAnsi="Arial" w:cs="Arial"/>
-                <w:color w:val="C00000"/>
-                <w:sz w:val="20"/>
-                <w:szCs w:val="20"/>
-              </w:rPr>
-              <w:t xml:space="preserve"> for:</w:t>
+              <w:t>Testing for:</w:t>
             </w:r>
           </w:p>
           <w:p>
@@ -533,27 +522,7 @@
                 <w:bCs/>
                 <w:noProof/>
               </w:rPr>
-              <w:t>Login Page/L</w:t>
-            </w:r>
-            <w:r>
-              <w:rPr>
-                <w:rStyle w:val="Hyperlink"/>
-                <w:rFonts w:ascii="Arial" w:hAnsi="Arial" w:cs="Arial"/>
-                <w:b/>
-                <w:bCs/>
-                <w:noProof/>
-              </w:rPr>
-              <w:t>o</w:t>
-            </w:r>
-            <w:r>
-              <w:rPr>
-                <w:rStyle w:val="Hyperlink"/>
-                <w:rFonts w:ascii="Arial" w:hAnsi="Arial" w:cs="Arial"/>
-                <w:b/>
-                <w:bCs/>
-                <w:noProof/>
-              </w:rPr>
-              <w:t>gout System</w:t>
+              <w:t>Login Page/Logout System</w:t>
             </w:r>
             <w:r>
               <w:rPr>
@@ -978,25 +947,7 @@
           <w:sz w:val="24"/>
           <w:szCs w:val="24"/>
         </w:rPr>
-        <w:t xml:space="preserve"> should:  provide a test description, a test objective, the </w:t>
-      </w:r>
-      <w:proofErr w:type="gramStart"/>
-      <w:r>
-        <w:rPr>
-          <w:rFonts w:ascii="Arial" w:hAnsi="Arial" w:cs="Arial"/>
-          <w:sz w:val="24"/>
-          <w:szCs w:val="24"/>
-        </w:rPr>
-        <w:t>developer</w:t>
-      </w:r>
-      <w:proofErr w:type="gramEnd"/>
-      <w:r>
-        <w:rPr>
-          <w:rFonts w:ascii="Arial" w:hAnsi="Arial" w:cs="Arial"/>
-          <w:sz w:val="24"/>
-          <w:szCs w:val="24"/>
-        </w:rPr>
-        <w:t xml:space="preserve"> name and date tested. </w:t>
+        <w:t xml:space="preserve"> should:  provide a test description, a test objective, the developer name and date tested. </w:t>
       </w:r>
       <w:r>
         <w:rPr>
@@ -1744,25 +1695,7 @@
                 <w:sz w:val="20"/>
                 <w:szCs w:val="20"/>
               </w:rPr>
-              <w:t>&lt;</w:t>
-            </w:r>
-            <w:r>
-              <w:rPr>
-                <w:rFonts w:ascii="Arial" w:hAnsi="Arial" w:cs="Arial"/>
-                <w:color w:val="C00000"/>
-                <w:sz w:val="20"/>
-                <w:szCs w:val="20"/>
-              </w:rPr>
-              <w:t>yes</w:t>
-            </w:r>
-            <w:r>
-              <w:rPr>
-                <w:rFonts w:ascii="Arial" w:hAnsi="Arial" w:cs="Arial"/>
-                <w:color w:val="C00000"/>
-                <w:sz w:val="20"/>
-                <w:szCs w:val="20"/>
-              </w:rPr>
-              <w:t>&gt;</w:t>
+              <w:t>Pass</w:t>
             </w:r>
           </w:p>
         </w:tc>
@@ -1770,6 +1703,28 @@
           <w:tcPr>
             <w:tcW w:w="2052" w:type="dxa"/>
           </w:tcPr>
+          <w:p>
+            <w:pPr>
+              <w:spacing w:before="80" w:after="80"/>
+              <w:rPr>
+                <w:rFonts w:ascii="Arial" w:hAnsi="Arial" w:cs="Arial"/>
+                <w:noProof/>
+                <w:color w:val="C00000"/>
+                <w:sz w:val="20"/>
+                <w:szCs w:val="20"/>
+              </w:rPr>
+            </w:pPr>
+            <w:r>
+              <w:rPr>
+                <w:rFonts w:ascii="Arial" w:hAnsi="Arial" w:cs="Arial"/>
+                <w:noProof/>
+                <w:color w:val="C00000"/>
+                <w:sz w:val="20"/>
+                <w:szCs w:val="20"/>
+              </w:rPr>
+              <w:t>Pass</w:t>
+            </w:r>
+          </w:p>
           <w:p>
             <w:pPr>
               <w:spacing w:before="80" w:after="80"/>
@@ -1952,7 +1907,25 @@
                 <w:sz w:val="20"/>
                 <w:szCs w:val="20"/>
               </w:rPr>
-              <w:t xml:space="preserve">Try to login with </w:t>
+              <w:t xml:space="preserve">Try to </w:t>
+            </w:r>
+            <w:r>
+              <w:rPr>
+                <w:rFonts w:ascii="Arial" w:hAnsi="Arial" w:cs="Arial"/>
+                <w:color w:val="C00000"/>
+                <w:sz w:val="20"/>
+                <w:szCs w:val="20"/>
+              </w:rPr>
+              <w:t>log in</w:t>
+            </w:r>
+            <w:r>
+              <w:rPr>
+                <w:rFonts w:ascii="Arial" w:hAnsi="Arial" w:cs="Arial"/>
+                <w:color w:val="C00000"/>
+                <w:sz w:val="20"/>
+                <w:szCs w:val="20"/>
+              </w:rPr>
+              <w:t xml:space="preserve"> with </w:t>
             </w:r>
             <w:r>
               <w:rPr>
@@ -2047,7 +2020,7 @@
                 <w:sz w:val="20"/>
                 <w:szCs w:val="20"/>
               </w:rPr>
-              <w:t>&lt;yes&gt;</w:t>
+              <w:t>Pass</w:t>
             </w:r>
           </w:p>
         </w:tc>
@@ -2068,15 +2041,35 @@
             <w:r>
               <w:rPr>
                 <w:rFonts w:ascii="Arial" w:hAnsi="Arial" w:cs="Arial"/>
+                <w:color w:val="C00000"/>
+                <w:sz w:val="20"/>
+                <w:szCs w:val="20"/>
+              </w:rPr>
+              <w:t>Pass</w:t>
+            </w:r>
+          </w:p>
+          <w:p>
+            <w:pPr>
+              <w:spacing w:before="80" w:after="80"/>
+              <w:rPr>
+                <w:rFonts w:ascii="Arial" w:hAnsi="Arial" w:cs="Arial"/>
+                <w:color w:val="C00000"/>
+                <w:sz w:val="20"/>
+                <w:szCs w:val="20"/>
+              </w:rPr>
+            </w:pPr>
+            <w:r>
+              <w:rPr>
+                <w:rFonts w:ascii="Arial" w:hAnsi="Arial" w:cs="Arial"/>
                 <w:noProof/>
                 <w:color w:val="C00000"/>
                 <w:sz w:val="20"/>
                 <w:szCs w:val="20"/>
               </w:rPr>
               <w:drawing>
-                <wp:inline distT="0" distB="0" distL="0" distR="0" wp14:anchorId="14034C81" wp14:editId="5D9AA529">
-                  <wp:extent cx="3324689" cy="3200847"/>
-                  <wp:effectExtent l="0" t="0" r="9525" b="0"/>
+                <wp:inline distT="0" distB="0" distL="0" distR="0" wp14:anchorId="14034C81" wp14:editId="17B5D2EF">
+                  <wp:extent cx="1699260" cy="1635964"/>
+                  <wp:effectExtent l="0" t="0" r="0" b="2540"/>
                   <wp:docPr id="1017079377" name="Picture 1"/>
                   <wp:cNvGraphicFramePr>
                     <a:graphicFrameLocks xmlns:a="http://schemas.openxmlformats.org/drawingml/2006/main" noChangeAspect="1"/>
@@ -2097,7 +2090,7 @@
                         <pic:spPr>
                           <a:xfrm>
                             <a:off x="0" y="0"/>
-                            <a:ext cx="3324689" cy="3200847"/>
+                            <a:ext cx="1700912" cy="1637554"/>
                           </a:xfrm>
                           <a:prstGeom prst="rect">
                             <a:avLst/>
@@ -2135,7 +2128,6 @@
                 <w:sz w:val="20"/>
                 <w:szCs w:val="20"/>
               </w:rPr>
-              <w:lastRenderedPageBreak/>
               <w:t>3</w:t>
             </w:r>
           </w:p>
@@ -2247,7 +2239,7 @@
                 <w:sz w:val="20"/>
                 <w:szCs w:val="20"/>
               </w:rPr>
-              <w:t>&lt;yes&gt;</w:t>
+              <w:t>Pass</w:t>
             </w:r>
           </w:p>
         </w:tc>
@@ -2268,15 +2260,35 @@
             <w:r>
               <w:rPr>
                 <w:rFonts w:ascii="Arial" w:hAnsi="Arial" w:cs="Arial"/>
+                <w:color w:val="C00000"/>
+                <w:sz w:val="20"/>
+                <w:szCs w:val="20"/>
+              </w:rPr>
+              <w:t>Pass</w:t>
+            </w:r>
+          </w:p>
+          <w:p>
+            <w:pPr>
+              <w:spacing w:before="80" w:after="80"/>
+              <w:rPr>
+                <w:rFonts w:ascii="Arial" w:hAnsi="Arial" w:cs="Arial"/>
+                <w:color w:val="C00000"/>
+                <w:sz w:val="20"/>
+                <w:szCs w:val="20"/>
+              </w:rPr>
+            </w:pPr>
+            <w:r>
+              <w:rPr>
+                <w:rFonts w:ascii="Arial" w:hAnsi="Arial" w:cs="Arial"/>
                 <w:noProof/>
                 <w:color w:val="C00000"/>
                 <w:sz w:val="20"/>
                 <w:szCs w:val="20"/>
               </w:rPr>
               <w:drawing>
-                <wp:inline distT="0" distB="0" distL="0" distR="0" wp14:anchorId="6EED4AE1" wp14:editId="205E8BA2">
-                  <wp:extent cx="3086531" cy="2972215"/>
-                  <wp:effectExtent l="0" t="0" r="0" b="0"/>
+                <wp:inline distT="0" distB="0" distL="0" distR="0" wp14:anchorId="6EED4AE1" wp14:editId="6752E5DF">
+                  <wp:extent cx="1760220" cy="1695027"/>
+                  <wp:effectExtent l="0" t="0" r="0" b="635"/>
                   <wp:docPr id="358728391" name="Picture 1"/>
                   <wp:cNvGraphicFramePr>
                     <a:graphicFrameLocks xmlns:a="http://schemas.openxmlformats.org/drawingml/2006/main" noChangeAspect="1"/>
@@ -2297,7 +2309,7 @@
                         <pic:spPr>
                           <a:xfrm>
                             <a:off x="0" y="0"/>
-                            <a:ext cx="3086531" cy="2972215"/>
+                            <a:ext cx="1763218" cy="1697914"/>
                           </a:xfrm>
                           <a:prstGeom prst="rect">
                             <a:avLst/>
@@ -2310,6 +2322,28 @@
               </w:drawing>
             </w:r>
           </w:p>
+          <w:p>
+            <w:pPr>
+              <w:spacing w:before="80" w:after="80"/>
+              <w:rPr>
+                <w:rFonts w:ascii="Arial" w:hAnsi="Arial" w:cs="Arial"/>
+                <w:color w:val="C00000"/>
+                <w:sz w:val="20"/>
+                <w:szCs w:val="20"/>
+              </w:rPr>
+            </w:pPr>
+          </w:p>
+          <w:p>
+            <w:pPr>
+              <w:spacing w:before="80" w:after="80"/>
+              <w:rPr>
+                <w:rFonts w:ascii="Arial" w:hAnsi="Arial" w:cs="Arial"/>
+                <w:color w:val="C00000"/>
+                <w:sz w:val="20"/>
+                <w:szCs w:val="20"/>
+              </w:rPr>
+            </w:pPr>
+          </w:p>
         </w:tc>
       </w:tr>
       <w:tr>
@@ -2335,6 +2369,7 @@
                 <w:sz w:val="20"/>
                 <w:szCs w:val="20"/>
               </w:rPr>
+              <w:lastRenderedPageBreak/>
               <w:t>4</w:t>
             </w:r>
           </w:p>
@@ -2464,25 +2499,7 @@
                 <w:sz w:val="20"/>
                 <w:szCs w:val="20"/>
               </w:rPr>
-              <w:t>&lt;</w:t>
-            </w:r>
-            <w:r>
-              <w:rPr>
-                <w:rFonts w:ascii="Arial" w:hAnsi="Arial" w:cs="Arial"/>
-                <w:color w:val="C00000"/>
-                <w:sz w:val="20"/>
-                <w:szCs w:val="20"/>
-              </w:rPr>
-              <w:t>yest</w:t>
-            </w:r>
-            <w:r>
-              <w:rPr>
-                <w:rFonts w:ascii="Arial" w:hAnsi="Arial" w:cs="Arial"/>
-                <w:color w:val="C00000"/>
-                <w:sz w:val="20"/>
-                <w:szCs w:val="20"/>
-              </w:rPr>
-              <w:t>&gt;</w:t>
+              <w:t>Pass</w:t>
             </w:r>
           </w:p>
         </w:tc>
@@ -2500,6 +2517,15 @@
                 <w:szCs w:val="20"/>
               </w:rPr>
             </w:pPr>
+            <w:r>
+              <w:rPr>
+                <w:rFonts w:ascii="Arial" w:hAnsi="Arial" w:cs="Arial"/>
+                <w:color w:val="C00000"/>
+                <w:sz w:val="20"/>
+                <w:szCs w:val="20"/>
+              </w:rPr>
+              <w:t>Pass</w:t>
+            </w:r>
           </w:p>
           <w:p>
             <w:pPr>
@@ -2520,9 +2546,9 @@
                 <w:szCs w:val="20"/>
               </w:rPr>
               <w:drawing>
-                <wp:inline distT="0" distB="0" distL="0" distR="0" wp14:anchorId="26295689" wp14:editId="4B7FCFD1">
-                  <wp:extent cx="2041314" cy="1487170"/>
-                  <wp:effectExtent l="0" t="0" r="0" b="0"/>
+                <wp:inline distT="0" distB="0" distL="0" distR="0" wp14:anchorId="26295689" wp14:editId="7E3E1EBF">
+                  <wp:extent cx="2026920" cy="1476684"/>
+                  <wp:effectExtent l="0" t="0" r="0" b="9525"/>
                   <wp:docPr id="1183717742" name="Picture 1"/>
                   <wp:cNvGraphicFramePr>
                     <a:graphicFrameLocks xmlns:a="http://schemas.openxmlformats.org/drawingml/2006/main" noChangeAspect="1"/>
@@ -2543,7 +2569,7 @@
                         <pic:spPr>
                           <a:xfrm>
                             <a:off x="0" y="0"/>
-                            <a:ext cx="2056912" cy="1498534"/>
+                            <a:ext cx="2049478" cy="1493118"/>
                           </a:xfrm>
                           <a:prstGeom prst="rect">
                             <a:avLst/>
@@ -2564,9 +2590,9 @@
                 <w:szCs w:val="20"/>
               </w:rPr>
               <w:drawing>
-                <wp:inline distT="0" distB="0" distL="0" distR="0" wp14:anchorId="7F1F882C" wp14:editId="2130065C">
-                  <wp:extent cx="2700497" cy="1003935"/>
-                  <wp:effectExtent l="0" t="0" r="5080" b="5715"/>
+                <wp:inline distT="0" distB="0" distL="0" distR="0" wp14:anchorId="7F1F882C" wp14:editId="75D8C59A">
+                  <wp:extent cx="3149728" cy="1170940"/>
+                  <wp:effectExtent l="0" t="0" r="0" b="0"/>
                   <wp:docPr id="326755942" name="Picture 1"/>
                   <wp:cNvGraphicFramePr>
                     <a:graphicFrameLocks xmlns:a="http://schemas.openxmlformats.org/drawingml/2006/main" noChangeAspect="1"/>
@@ -2587,7 +2613,7 @@
                         <pic:spPr>
                           <a:xfrm>
                             <a:off x="0" y="0"/>
-                            <a:ext cx="2710106" cy="1007507"/>
+                            <a:ext cx="3169013" cy="1178109"/>
                           </a:xfrm>
                           <a:prstGeom prst="rect">
                             <a:avLst/>
@@ -2625,7 +2651,6 @@
                 <w:sz w:val="20"/>
                 <w:szCs w:val="20"/>
               </w:rPr>
-              <w:lastRenderedPageBreak/>
               <w:t>5</w:t>
             </w:r>
           </w:p>
@@ -2660,7 +2685,25 @@
                 <w:sz w:val="20"/>
                 <w:szCs w:val="20"/>
               </w:rPr>
-              <w:t>Try to login after already being logged in</w:t>
+              <w:t xml:space="preserve">Try to </w:t>
+            </w:r>
+            <w:r>
+              <w:rPr>
+                <w:rFonts w:ascii="Arial" w:hAnsi="Arial" w:cs="Arial"/>
+                <w:color w:val="C00000"/>
+                <w:sz w:val="20"/>
+                <w:szCs w:val="20"/>
+              </w:rPr>
+              <w:t>log in</w:t>
+            </w:r>
+            <w:r>
+              <w:rPr>
+                <w:rFonts w:ascii="Arial" w:hAnsi="Arial" w:cs="Arial"/>
+                <w:color w:val="C00000"/>
+                <w:sz w:val="20"/>
+                <w:szCs w:val="20"/>
+              </w:rPr>
+              <w:t xml:space="preserve"> after already being logged in</w:t>
             </w:r>
             <w:r>
               <w:rPr>
@@ -2694,25 +2737,7 @@
                 <w:sz w:val="20"/>
                 <w:szCs w:val="20"/>
               </w:rPr>
-              <w:t>&lt;</w:t>
-            </w:r>
-            <w:r>
-              <w:rPr>
-                <w:rFonts w:ascii="Arial" w:hAnsi="Arial" w:cs="Arial"/>
-                <w:color w:val="C00000"/>
-                <w:sz w:val="20"/>
-                <w:szCs w:val="20"/>
-              </w:rPr>
-              <w:t>Already logged in, log out before continuing message</w:t>
-            </w:r>
-            <w:r>
-              <w:rPr>
-                <w:rFonts w:ascii="Arial" w:hAnsi="Arial" w:cs="Arial"/>
-                <w:color w:val="C00000"/>
-                <w:sz w:val="20"/>
-                <w:szCs w:val="20"/>
-              </w:rPr>
-              <w:t>&gt;</w:t>
+              <w:t>&lt;User remains logged in or session is overwritten&gt;</w:t>
             </w:r>
           </w:p>
         </w:tc>
@@ -2737,45 +2762,7 @@
                 <w:sz w:val="20"/>
                 <w:szCs w:val="20"/>
               </w:rPr>
-              <w:t>&lt;no</w:t>
-            </w:r>
-            <w:r>
-              <w:rPr>
-                <w:rFonts w:ascii="Arial" w:hAnsi="Arial" w:cs="Arial"/>
-                <w:color w:val="C00000"/>
-                <w:sz w:val="20"/>
-                <w:szCs w:val="20"/>
-              </w:rPr>
-              <w:t xml:space="preserve">, </w:t>
-            </w:r>
-            <w:proofErr w:type="gramStart"/>
-            <w:r>
-              <w:rPr>
-                <w:rFonts w:ascii="Arial" w:hAnsi="Arial" w:cs="Arial"/>
-                <w:color w:val="C00000"/>
-                <w:sz w:val="20"/>
-                <w:szCs w:val="20"/>
-              </w:rPr>
-              <w:t>allows</w:t>
-            </w:r>
-            <w:proofErr w:type="gramEnd"/>
-            <w:r>
-              <w:rPr>
-                <w:rFonts w:ascii="Arial" w:hAnsi="Arial" w:cs="Arial"/>
-                <w:color w:val="C00000"/>
-                <w:sz w:val="20"/>
-                <w:szCs w:val="20"/>
-              </w:rPr>
-              <w:t xml:space="preserve"> me to login again</w:t>
-            </w:r>
-            <w:r>
-              <w:rPr>
-                <w:rFonts w:ascii="Arial" w:hAnsi="Arial" w:cs="Arial"/>
-                <w:color w:val="C00000"/>
-                <w:sz w:val="20"/>
-                <w:szCs w:val="20"/>
-              </w:rPr>
-              <w:t>&gt;</w:t>
+              <w:t>Fail</w:t>
             </w:r>
           </w:p>
         </w:tc>
@@ -2783,6 +2770,26 @@
           <w:tcPr>
             <w:tcW w:w="2052" w:type="dxa"/>
           </w:tcPr>
+          <w:p>
+            <w:pPr>
+              <w:spacing w:before="80" w:after="80"/>
+              <w:rPr>
+                <w:rFonts w:ascii="Arial" w:hAnsi="Arial" w:cs="Arial"/>
+                <w:color w:val="C00000"/>
+                <w:sz w:val="20"/>
+                <w:szCs w:val="20"/>
+              </w:rPr>
+            </w:pPr>
+            <w:r>
+              <w:rPr>
+                <w:rFonts w:ascii="Arial" w:hAnsi="Arial" w:cs="Arial"/>
+                <w:color w:val="C00000"/>
+                <w:sz w:val="20"/>
+                <w:szCs w:val="20"/>
+              </w:rPr>
+              <w:t>Fail</w:t>
+            </w:r>
+          </w:p>
           <w:p>
             <w:pPr>
               <w:spacing w:before="80" w:after="80"/>
@@ -2848,6 +2855,28 @@
                 <w:szCs w:val="20"/>
               </w:rPr>
             </w:pPr>
+          </w:p>
+          <w:p>
+            <w:pPr>
+              <w:spacing w:before="80" w:after="80"/>
+              <w:rPr>
+                <w:rFonts w:ascii="Arial" w:hAnsi="Arial" w:cs="Arial"/>
+                <w:color w:val="C00000"/>
+                <w:sz w:val="20"/>
+                <w:szCs w:val="20"/>
+              </w:rPr>
+            </w:pPr>
+          </w:p>
+          <w:p>
+            <w:pPr>
+              <w:spacing w:before="80" w:after="80"/>
+              <w:rPr>
+                <w:rFonts w:ascii="Arial" w:hAnsi="Arial" w:cs="Arial"/>
+                <w:color w:val="C00000"/>
+                <w:sz w:val="20"/>
+                <w:szCs w:val="20"/>
+              </w:rPr>
+            </w:pPr>
             <w:r>
               <w:rPr>
                 <w:rFonts w:ascii="Arial" w:hAnsi="Arial" w:cs="Arial"/>
@@ -2856,6 +2885,7 @@
                 <w:sz w:val="20"/>
                 <w:szCs w:val="20"/>
               </w:rPr>
+              <w:lastRenderedPageBreak/>
               <w:drawing>
                 <wp:inline distT="0" distB="0" distL="0" distR="0" wp14:anchorId="20FCE958" wp14:editId="01E1B76E">
                   <wp:extent cx="3025140" cy="2501131"/>
@@ -2922,6 +2952,7 @@
                 <w:sz w:val="20"/>
                 <w:szCs w:val="20"/>
               </w:rPr>
+              <w:lastRenderedPageBreak/>
               <w:t>Comments</w:t>
             </w:r>
           </w:p>
@@ -3001,7 +3032,6 @@
                 <w:sz w:val="24"/>
                 <w:szCs w:val="24"/>
               </w:rPr>
-              <w:lastRenderedPageBreak/>
               <w:t xml:space="preserve">Test </w:t>
             </w:r>
             <w:r>
@@ -3154,27 +3184,7 @@
                 <w:sz w:val="20"/>
                 <w:szCs w:val="20"/>
               </w:rPr>
-              <w:t>&lt;</w:t>
-            </w:r>
-            <w:proofErr w:type="spellStart"/>
-            <w:r>
-              <w:rPr>
-                <w:rFonts w:ascii="Arial" w:hAnsi="Arial" w:cs="Arial"/>
-                <w:color w:val="C00000"/>
-                <w:sz w:val="20"/>
-                <w:szCs w:val="20"/>
-              </w:rPr>
-              <w:t>yyyy</w:t>
-            </w:r>
-            <w:proofErr w:type="spellEnd"/>
-            <w:r>
-              <w:rPr>
-                <w:rFonts w:ascii="Arial" w:hAnsi="Arial" w:cs="Arial"/>
-                <w:color w:val="C00000"/>
-                <w:sz w:val="20"/>
-                <w:szCs w:val="20"/>
-              </w:rPr>
-              <w:t xml:space="preserve">/mm/dd&gt; </w:t>
+              <w:t xml:space="preserve">&lt;yyyy/mm/dd&gt; </w:t>
             </w:r>
           </w:p>
         </w:tc>
@@ -3237,27 +3247,7 @@
                 <w:sz w:val="20"/>
                 <w:szCs w:val="20"/>
               </w:rPr>
-              <w:t>&lt;</w:t>
-            </w:r>
-            <w:proofErr w:type="spellStart"/>
-            <w:r>
-              <w:rPr>
-                <w:rFonts w:ascii="Arial" w:hAnsi="Arial" w:cs="Arial"/>
-                <w:color w:val="C00000"/>
-                <w:sz w:val="20"/>
-                <w:szCs w:val="20"/>
-              </w:rPr>
-              <w:t>yyyy</w:t>
-            </w:r>
-            <w:proofErr w:type="spellEnd"/>
-            <w:r>
-              <w:rPr>
-                <w:rFonts w:ascii="Arial" w:hAnsi="Arial" w:cs="Arial"/>
-                <w:color w:val="C00000"/>
-                <w:sz w:val="20"/>
-                <w:szCs w:val="20"/>
-              </w:rPr>
-              <w:t>/mm/dd&gt;</w:t>
+              <w:t>&lt;yyyy/mm/dd&gt;</w:t>
             </w:r>
           </w:p>
         </w:tc>
@@ -4069,6 +4059,7 @@
                 <w:sz w:val="20"/>
                 <w:szCs w:val="20"/>
               </w:rPr>
+              <w:lastRenderedPageBreak/>
               <w:t>Comments</w:t>
             </w:r>
           </w:p>
@@ -4300,27 +4291,7 @@
                 <w:sz w:val="20"/>
                 <w:szCs w:val="20"/>
               </w:rPr>
-              <w:t>&lt;</w:t>
-            </w:r>
-            <w:proofErr w:type="spellStart"/>
-            <w:r>
-              <w:rPr>
-                <w:rFonts w:ascii="Arial" w:hAnsi="Arial" w:cs="Arial"/>
-                <w:color w:val="C00000"/>
-                <w:sz w:val="20"/>
-                <w:szCs w:val="20"/>
-              </w:rPr>
-              <w:t>yyyy</w:t>
-            </w:r>
-            <w:proofErr w:type="spellEnd"/>
-            <w:r>
-              <w:rPr>
-                <w:rFonts w:ascii="Arial" w:hAnsi="Arial" w:cs="Arial"/>
-                <w:color w:val="C00000"/>
-                <w:sz w:val="20"/>
-                <w:szCs w:val="20"/>
-              </w:rPr>
-              <w:t xml:space="preserve">/mm/dd&gt; </w:t>
+              <w:t xml:space="preserve">&lt;yyyy/mm/dd&gt; </w:t>
             </w:r>
           </w:p>
         </w:tc>
@@ -4383,27 +4354,7 @@
                 <w:sz w:val="20"/>
                 <w:szCs w:val="20"/>
               </w:rPr>
-              <w:t>&lt;</w:t>
-            </w:r>
-            <w:proofErr w:type="spellStart"/>
-            <w:r>
-              <w:rPr>
-                <w:rFonts w:ascii="Arial" w:hAnsi="Arial" w:cs="Arial"/>
-                <w:color w:val="C00000"/>
-                <w:sz w:val="20"/>
-                <w:szCs w:val="20"/>
-              </w:rPr>
-              <w:t>yyyy</w:t>
-            </w:r>
-            <w:proofErr w:type="spellEnd"/>
-            <w:r>
-              <w:rPr>
-                <w:rFonts w:ascii="Arial" w:hAnsi="Arial" w:cs="Arial"/>
-                <w:color w:val="C00000"/>
-                <w:sz w:val="20"/>
-                <w:szCs w:val="20"/>
-              </w:rPr>
-              <w:t>/mm/dd&gt;</w:t>
+              <w:t>&lt;yyyy/mm/dd&gt;</w:t>
             </w:r>
           </w:p>
         </w:tc>
@@ -6233,6 +6184,7 @@
   <w:style w:type="character" w:default="1" w:styleId="DefaultParagraphFont">
     <w:name w:val="Default Paragraph Font"/>
     <w:uiPriority w:val="1"/>
+    <w:semiHidden/>
     <w:unhideWhenUsed/>
   </w:style>
   <w:style w:type="table" w:default="1" w:styleId="TableNormal">

</xml_diff>